<commit_message>
Generated CPI Documentation for package Employedata
</commit_message>
<xml_diff>
--- a/cpi-artifacts/Employedata/PRD_IF_EmployeeCreation_SF_to_S4_MDF_copy_100228/src/main/resources/scenarioflows/integrationflow/docs/Prototype_Iflow_Documentation.docx
+++ b/cpi-artifacts/Employedata/PRD_IF_EmployeeCreation_SF_to_S4_MDF_copy_100228/src/main/resources/scenarioflows/integrationflow/docs/Prototype_Iflow_Documentation.docx
@@ -7,7 +7,207 @@
         <w:pStyle w:val="FirstParagraph"/>
       </w:pPr>
       <w:r>
-        <w:t xml:space="preserve">It seems like you’ve shared a JSON array of values, but could you please clarify what exactly you’d like to know or process from this data? There are many ways to interpret this array—maybe you want to find the maximum value, sum all the numbers, count certain properties, or perform some other operation. Please provide more details so I can help!</w:t>
+        <w:t xml:space="preserve">The array contains an array of numerical values that are formatted as comma-separated strings with the format</w:t>
+      </w:r>
+      <w:r>
+        <w:t xml:space="preserve"> </w:t>
+      </w:r>
+      <w:r>
+        <w:t xml:space="preserve">“</w:t>
+      </w:r>
+      <w:r>
+        <w:t xml:space="preserve">value, value</w:t>
+      </w:r>
+      <w:r>
+        <w:t xml:space="preserve">”</w:t>
+      </w:r>
+      <w:r>
+        <w:t xml:space="preserve">. These values appear to represent a structured representation of objects or components within a larger structure. The specific pattern and values suggest they may be part of a UUID (Universally Unique Identifier), which is often used in object IDs to ensure uniqueness.</w:t>
+      </w:r>
+    </w:p>
+    <w:p>
+      <w:pPr>
+        <w:pStyle w:val="BodyText"/>
+      </w:pPr>
+      <w:r>
+        <w:t xml:space="preserve">The array starts with</w:t>
+      </w:r>
+      <w:r>
+        <w:t xml:space="preserve"> </w:t>
+      </w:r>
+      <w:r>
+        <w:rPr>
+          <w:rStyle w:val="VerbatimChar"/>
+        </w:rPr>
+        <w:t xml:space="preserve">707542</w:t>
+      </w:r>
+      <w:r>
+        <w:t xml:space="preserve"> </w:t>
+      </w:r>
+      <w:r>
+        <w:t xml:space="preserve">followed by two strings separated by commas:</w:t>
+      </w:r>
+      <w:r>
+        <w:t xml:space="preserve"> </w:t>
+      </w:r>
+      <w:r>
+        <w:rPr>
+          <w:rStyle w:val="VerbatimChar"/>
+        </w:rPr>
+        <w:t xml:space="preserve">'waypoint'</w:t>
+      </w:r>
+      <w:r>
+        <w:t xml:space="preserve">,</w:t>
+      </w:r>
+      <w:r>
+        <w:t xml:space="preserve"> </w:t>
+      </w:r>
+      <w:r>
+        <w:rPr>
+          <w:rStyle w:val="VerbatimChar"/>
+        </w:rPr>
+        <w:t xml:space="preserve">'waypoint'</w:t>
+      </w:r>
+      <w:r>
+        <w:t xml:space="preserve">. This suggests that these are components or segments within a larger structure, possibly part of a UUID. Each subsequent value follows the same pattern, indicating consistency and structured data organization.</w:t>
+      </w:r>
+    </w:p>
+    <w:p>
+      <w:pPr>
+        <w:pStyle w:val="BodyText"/>
+      </w:pPr>
+      <w:r>
+        <w:t xml:space="preserve">For example:</w:t>
+      </w:r>
+      <w:r>
+        <w:t xml:space="preserve"> </w:t>
+      </w:r>
+      <w:r>
+        <w:t xml:space="preserve">-</w:t>
+      </w:r>
+      <w:r>
+        <w:t xml:space="preserve"> </w:t>
+      </w:r>
+      <w:r>
+        <w:rPr>
+          <w:rStyle w:val="VerbatimChar"/>
+        </w:rPr>
+        <w:t xml:space="preserve">707933</w:t>
+      </w:r>
+      <w:r>
+        <w:t xml:space="preserve">,</w:t>
+      </w:r>
+      <w:r>
+        <w:t xml:space="preserve"> </w:t>
+      </w:r>
+      <w:r>
+        <w:rPr>
+          <w:rStyle w:val="VerbatimChar"/>
+        </w:rPr>
+        <w:t xml:space="preserve">'waypoint'</w:t>
+      </w:r>
+      <w:r>
+        <w:t xml:space="preserve"> </w:t>
+      </w:r>
+      <w:r>
+        <w:t xml:space="preserve">-</w:t>
+      </w:r>
+      <w:r>
+        <w:t xml:space="preserve"> </w:t>
+      </w:r>
+      <w:r>
+        <w:rPr>
+          <w:rStyle w:val="VerbatimChar"/>
+        </w:rPr>
+        <w:t xml:space="preserve">707642</w:t>
+      </w:r>
+      <w:r>
+        <w:t xml:space="preserve">,</w:t>
+      </w:r>
+      <w:r>
+        <w:t xml:space="preserve"> </w:t>
+      </w:r>
+      <w:r>
+        <w:rPr>
+          <w:rStyle w:val="VerbatimChar"/>
+        </w:rPr>
+        <w:t xml:space="preserve">'waypoint'</w:t>
+      </w:r>
+      <w:r>
+        <w:t xml:space="preserve"> </w:t>
+      </w:r>
+      <w:r>
+        <w:t xml:space="preserve">-</w:t>
+      </w:r>
+      <w:r>
+        <w:t xml:space="preserve"> </w:t>
+      </w:r>
+      <w:r>
+        <w:rPr>
+          <w:rStyle w:val="VerbatimChar"/>
+        </w:rPr>
+        <w:t xml:space="preserve">707934</w:t>
+      </w:r>
+      <w:r>
+        <w:t xml:space="preserve">,</w:t>
+      </w:r>
+      <w:r>
+        <w:t xml:space="preserve"> </w:t>
+      </w:r>
+      <w:r>
+        <w:rPr>
+          <w:rStyle w:val="VerbatimChar"/>
+        </w:rPr>
+        <w:t xml:space="preserve">'waypoint'</w:t>
+      </w:r>
+      <w:r>
+        <w:t xml:space="preserve"> </w:t>
+      </w:r>
+      <w:r>
+        <w:t xml:space="preserve">-</w:t>
+      </w:r>
+      <w:r>
+        <w:t xml:space="preserve"> </w:t>
+      </w:r>
+      <w:r>
+        <w:rPr>
+          <w:rStyle w:val="VerbatimChar"/>
+        </w:rPr>
+        <w:t xml:space="preserve">...</w:t>
+      </w:r>
+    </w:p>
+    <w:p>
+      <w:pPr>
+        <w:pStyle w:val="BodyText"/>
+      </w:pPr>
+      <w:r>
+        <w:t xml:space="preserve">If this is a UUID-like structure, the first value may be the start of the object ID, followed by various segments and waypoints. The use of multiple</w:t>
+      </w:r>
+      <w:r>
+        <w:t xml:space="preserve"> </w:t>
+      </w:r>
+      <w:r>
+        <w:t xml:space="preserve">‘</w:t>
+      </w:r>
+      <w:r>
+        <w:t xml:space="preserve">waypoint</w:t>
+      </w:r>
+      <w:r>
+        <w:t xml:space="preserve">’</w:t>
+      </w:r>
+      <w:r>
+        <w:t xml:space="preserve"> </w:t>
+      </w:r>
+      <w:r>
+        <w:t xml:space="preserve">values suggests that they are part of a hierarchical or sequential navigation system, possibly used in mapping software or similar applications.</w:t>
+      </w:r>
+    </w:p>
+    <w:p>
+      <w:pPr>
+        <w:pStyle w:val="BodyText"/>
+      </w:pPr>
+      <w:r>
+        <w:t xml:space="preserve">Without more context, it’s difficult to provide a specific interpretation beyond recognizing the structure as a list of components likely representing parts of an object ID or a navigational component.</w:t>
       </w:r>
     </w:p>
     <w:sectPr/>

</xml_diff>